<commit_message>
Esercizio 4: e il dolce svolto nel video tutorial
Co-Authored-By: Claude Opus 5.5 <noreply@anthropic.com>
</commit_message>
<xml_diff>
--- a/assets/esercizi-con-soluzioni.docx
+++ b/assets/esercizi-con-soluzioni.docx
@@ -4140,6 +4140,7 @@
           <w:sz w:val="28"/>
           <w:szCs w:val="28"/>
         </w:rPr>
+        <w:lastRenderedPageBreak/>
         <w:t>Determinare pertanto il costo del prodotto in base alla seguente scaletta:</w:t>
       </w:r>
     </w:p>
@@ -6263,6 +6264,7 @@
           <w:sz w:val="28"/>
           <w:szCs w:val="28"/>
         </w:rPr>
+        <w:lastRenderedPageBreak/>
         <w:t xml:space="preserve">Es. </w:t>
       </w:r>
       <w:r>
@@ -7271,6 +7273,7 @@
           <w:sz w:val="28"/>
           <w:szCs w:val="28"/>
         </w:rPr>
+        <w:lastRenderedPageBreak/>
         <w:t>Determinare pertanto il costo del prodotto in base alla seguente scaletta:</w:t>
       </w:r>
     </w:p>
@@ -8887,6 +8890,7 @@
           <w:sz w:val="28"/>
           <w:szCs w:val="28"/>
         </w:rPr>
+        <w:lastRenderedPageBreak/>
         <w:t>Es. 4</w:t>
       </w:r>
       <w:r>
@@ -9593,6 +9597,24 @@
           <w:sz w:val="28"/>
           <w:szCs w:val="28"/>
         </w:rPr>
+        <w:t>È il dolce svolto nel video tutorial: prova a rifarlo da solo, poi controlla con il video o con la soluzione.</w:t>
+      </w:r>
+      <w:r>
+        <w:rPr>
+          <w:rFonts w:asciiTheme="minorHAnsi" w:hAnsiTheme="minorHAnsi" w:cstheme="minorHAnsi"/>
+          <w:color w:val="000000"/>
+          <w:sz w:val="28"/>
+          <w:szCs w:val="28"/>
+        </w:rPr>
+        <w:br/>
+      </w:r>
+      <w:r>
+        <w:rPr>
+          <w:rFonts w:asciiTheme="minorHAnsi" w:hAnsiTheme="minorHAnsi" w:cstheme="minorHAnsi"/>
+          <w:color w:val="000000"/>
+          <w:sz w:val="28"/>
+          <w:szCs w:val="28"/>
+        </w:rPr>
         <w:t>Ingredienti per 10 persone (ricetta della prova di qualifica 2024). I prezzi sono nel listino prezzi, a parte.</w:t>
       </w:r>
       <w:r>
@@ -9608,24 +9630,7 @@
     </w:p>
     <w:p>
       <w:pPr>
-        <w:spacing w:after="160" w:line="259" w:lineRule="auto"/>
-        <w:rPr>
-          <w:rFonts w:asciiTheme="minorHAnsi" w:hAnsiTheme="minorHAnsi" w:cstheme="minorHAnsi"/>
-          <w:sz w:val="28"/>
-          <w:szCs w:val="28"/>
-        </w:rPr>
-      </w:pPr>
-      <w:r>
-        <w:rPr>
-          <w:rFonts w:asciiTheme="minorHAnsi" w:hAnsiTheme="minorHAnsi" w:cstheme="minorHAnsi"/>
-          <w:sz w:val="28"/>
-          <w:szCs w:val="28"/>
-        </w:rPr>
-        <w:br w:type="page"/>
-      </w:r>
-    </w:p>
-    <w:p>
-      <w:pPr>
+        <w:pageBreakBefore/>
         <w:spacing w:line="360" w:lineRule="auto"/>
         <w:jc w:val="both"/>
         <w:rPr>
@@ -9640,6 +9645,7 @@
           <w:sz w:val="28"/>
           <w:szCs w:val="28"/>
         </w:rPr>
+        <w:lastRenderedPageBreak/>
         <w:t>Determinare pertanto il costo del prodotto in base alla seguente scaletta:</w:t>
       </w:r>
     </w:p>
@@ -11171,6 +11177,7 @@
           <w:sz w:val="28"/>
           <w:szCs w:val="28"/>
         </w:rPr>
+        <w:lastRenderedPageBreak/>
         <w:t>Es. 5</w:t>
       </w:r>
       <w:r>
@@ -11914,6 +11921,7 @@
           <w:sz w:val="28"/>
           <w:szCs w:val="28"/>
         </w:rPr>
+        <w:lastRenderedPageBreak/>
         <w:t>Determinare pertanto il costo del prodotto in base alla seguente scaletta:</w:t>
       </w:r>
     </w:p>

</xml_diff>

<commit_message>
Costo zero: barretta e niente 0,00 nella somma (soluzione, lavagna, Word degli esercizi)
Co-Authored-By: Claude Opus 5.5 <noreply@anthropic.com>
</commit_message>
<xml_diff>
--- a/assets/esercizi-con-soluzioni.docx
+++ b/assets/esercizi-con-soluzioni.docx
@@ -10187,7 +10187,7 @@
                 <w:sz w:val="28"/>
                 <w:szCs w:val="28"/>
               </w:rPr>
-              <w:t xml:space="preserve">x = (0,20 · 0,5)/1000 = </w:t>
+              <w:t xml:space="preserve">x = (0,20 · 0,5)/1000 = 0,0001 → </w:t>
             </w:r>
             <w:r>
               <w:rPr>
@@ -10196,7 +10196,7 @@
                 <w:sz w:val="28"/>
                 <w:szCs w:val="28"/>
               </w:rPr>
-              <w:t>0,00 €</w:t>
+              <w:t>–</w:t>
             </w:r>
           </w:p>
         </w:tc>
@@ -10352,7 +10352,7 @@
           <w:sz w:val="28"/>
           <w:szCs w:val="28"/>
         </w:rPr>
-        <w:t xml:space="preserve">0,55 + 0,11 + 0,19 + 0,37 + 0,01 + 0,00 + 0,75 = </w:t>
+        <w:t xml:space="preserve">0,55 + 0,11 + 0,19 + 0,37 + 0,01 + 0,75 = </w:t>
       </w:r>
       <w:r>
         <w:rPr>

</xml_diff>